<commit_message>
fix: close consolidation acceptance pass
</commit_message>
<xml_diff>
--- a/docs/testing/SMF_Travel_Rapporto_Completo_Test_v1.3_2026-09-02.docx
+++ b/docs/testing/SMF_Travel_Rapporto_Completo_Test_v1.3_2026-09-02.docx
@@ -10808,7 +10808,7 @@
           <w:color w:val="102A35"/>
           <w:sz w:val="20"/>
         </w:rPr>
-        <w:t>La presente sezione registra una nuova riesecuzione tecnica del collaudo. Non sostituisce le evidenze manuali già raccolte: distingue i controlli nuovamente superati da quelli che richiedono il ripristino dell'ambiente locale.</w:t>
+        <w:t>La presente sezione registra una nuova riesecuzione tecnica del collaudo. Non sostituisce le evidenze manuali già raccolte: consolida i controlli automatici, le prove AWS/Bedrock e il collaudo autenticato eseguito in produzione.</w:t>
       </w:r>
     </w:p>
     <w:tbl>
@@ -11333,20 +11333,20 @@
         <w:tc>
           <w:tcPr>
             <w:tcW w:type="dxa" w:w="1500"/>
-            <w:shd w:fill="FFF4D6"/>
-          </w:tcPr>
-          <w:p>
-            <w:pPr>
-              <w:spacing w:before="0" w:after="40" w:line="252" w:lineRule="auto"/>
-            </w:pPr>
-            <w:r>
-              <w:rPr>
-                <w:rFonts w:ascii="Calibri" w:hAnsi="Calibri"/>
-                <w:b/>
-                <w:color w:val="8A5A00"/>
-                <w:sz w:val="16"/>
-              </w:rPr>
-              <w:t>DA RIESEGUIRE</w:t>
+            <w:shd w:fill="E7F4EA"/>
+          </w:tcPr>
+          <w:p>
+            <w:pPr>
+              <w:spacing w:before="0" w:after="40" w:line="252" w:lineRule="auto"/>
+            </w:pPr>
+            <w:r>
+              <w:rPr>
+                <w:rFonts w:ascii="Calibri" w:hAnsi="Calibri"/>
+                <w:b/>
+                <w:color w:val="23623A"/>
+                <w:sz w:val="16"/>
+              </w:rPr>
+              <w:t>SUPERATO</w:t>
             </w:r>
           </w:p>
         </w:tc>
@@ -11365,7 +11365,7 @@
                 <w:color w:val="102A35"/>
                 <w:sz w:val="16"/>
               </w:rPr>
-              <w:t>Sessione AWS locale scaduta; nessuna chiamata AI completata in questa sessione.</w:t>
+              <w:t>Import preventivo, contenuti Paese e valutazione fotografica eseguiti con Amazon Nova.</w:t>
             </w:r>
           </w:p>
         </w:tc>
@@ -11386,27 +11386,27 @@
                 <w:color w:val="102A35"/>
                 <w:sz w:val="16"/>
               </w:rPr>
-              <w:t>Autorizzazione ruolo DB runtime</w:t>
+              <w:t>Dataset fotografico AI</w:t>
             </w:r>
           </w:p>
         </w:tc>
         <w:tc>
           <w:tcPr>
             <w:tcW w:type="dxa" w:w="1500"/>
-            <w:shd w:fill="FFF4D6"/>
-          </w:tcPr>
-          <w:p>
-            <w:pPr>
-              <w:spacing w:before="0" w:after="40" w:line="252" w:lineRule="auto"/>
-            </w:pPr>
-            <w:r>
-              <w:rPr>
-                <w:rFonts w:ascii="Calibri" w:hAnsi="Calibri"/>
-                <w:b/>
-                <w:color w:val="8A5A00"/>
-                <w:sz w:val="16"/>
-              </w:rPr>
-              <w:t>DA RIESEGUIRE</w:t>
+            <w:shd w:fill="E7F4EA"/>
+          </w:tcPr>
+          <w:p>
+            <w:pPr>
+              <w:spacing w:before="0" w:after="40" w:line="252" w:lineRule="auto"/>
+            </w:pPr>
+            <w:r>
+              <w:rPr>
+                <w:rFonts w:ascii="Calibri" w:hAnsi="Calibri"/>
+                <w:b/>
+                <w:color w:val="23623A"/>
+                <w:sz w:val="16"/>
+              </w:rPr>
+              <w:t>SUPERATO</w:t>
             </w:r>
           </w:p>
         </w:tc>
@@ -11425,7 +11425,7 @@
                 <w:color w:val="102A35"/>
                 <w:sz w:val="16"/>
               </w:rPr>
-              <w:t>Manca una DATABASE_URL locale valida per il ruolo applicativo ridotto.</w:t>
+              <w:t>18/18 valutazioni corrette; zero falsi positivi e negativi, verdetto stabile.</w:t>
             </w:r>
           </w:p>
         </w:tc>
@@ -11446,27 +11446,27 @@
                 <w:color w:val="102A35"/>
                 <w:sz w:val="16"/>
               </w:rPr>
-              <w:t>Browser autenticato</w:t>
+              <w:t>Autorizzazione ruolo DB runtime</w:t>
             </w:r>
           </w:p>
         </w:tc>
         <w:tc>
           <w:tcPr>
             <w:tcW w:type="dxa" w:w="1500"/>
-            <w:shd w:fill="FFF4D6"/>
-          </w:tcPr>
-          <w:p>
-            <w:pPr>
-              <w:spacing w:before="0" w:after="40" w:line="252" w:lineRule="auto"/>
-            </w:pPr>
-            <w:r>
-              <w:rPr>
-                <w:rFonts w:ascii="Calibri" w:hAnsi="Calibri"/>
-                <w:b/>
-                <w:color w:val="8A5A00"/>
-                <w:sz w:val="16"/>
-              </w:rPr>
-              <w:t>DA RIESEGUIRE</w:t>
+            <w:shd w:fill="E7F4EA"/>
+          </w:tcPr>
+          <w:p>
+            <w:pPr>
+              <w:spacing w:before="0" w:after="40" w:line="252" w:lineRule="auto"/>
+            </w:pPr>
+            <w:r>
+              <w:rPr>
+                <w:rFonts w:ascii="Calibri" w:hAnsi="Calibri"/>
+                <w:b/>
+                <w:color w:val="23623A"/>
+                <w:sz w:val="16"/>
+              </w:rPr>
+              <w:t>SUPERATO</w:t>
             </w:r>
           </w:p>
         </w:tc>
@@ -11485,7 +11485,187 @@
                 <w:color w:val="102A35"/>
                 <w:sz w:val="16"/>
               </w:rPr>
-              <w:t>Le sessioni disponibili sono ferme al login; richiesta una sessione autenticata per i ruoli principali.</w:t>
+              <w:t>Identità, impersonazione, scope viaggiatore, media e mutazioni verificati assumendo smf_app.</w:t>
+            </w:r>
+          </w:p>
+        </w:tc>
+      </w:tr>
+      <w:tr>
+        <w:tc>
+          <w:tcPr>
+            <w:tcW w:type="dxa" w:w="2700"/>
+          </w:tcPr>
+          <w:p>
+            <w:pPr>
+              <w:spacing w:before="0" w:after="40" w:line="252" w:lineRule="auto"/>
+            </w:pPr>
+            <w:r>
+              <w:rPr>
+                <w:rFonts w:ascii="Calibri" w:hAnsi="Calibri"/>
+                <w:b/>
+                <w:color w:val="102A35"/>
+                <w:sz w:val="16"/>
+              </w:rPr>
+              <w:t>Cancellazione agenzia asincrona</w:t>
+            </w:r>
+          </w:p>
+        </w:tc>
+        <w:tc>
+          <w:tcPr>
+            <w:tcW w:type="dxa" w:w="1500"/>
+            <w:shd w:fill="E7F4EA"/>
+          </w:tcPr>
+          <w:p>
+            <w:pPr>
+              <w:spacing w:before="0" w:after="40" w:line="252" w:lineRule="auto"/>
+            </w:pPr>
+            <w:r>
+              <w:rPr>
+                <w:rFonts w:ascii="Calibri" w:hAnsi="Calibri"/>
+                <w:b/>
+                <w:color w:val="23623A"/>
+                <w:sz w:val="16"/>
+              </w:rPr>
+              <w:t>SUPERATO</w:t>
+            </w:r>
+          </w:p>
+        </w:tc>
+        <w:tc>
+          <w:tcPr>
+            <w:tcW w:type="dxa" w:w="5160"/>
+          </w:tcPr>
+          <w:p>
+            <w:pPr>
+              <w:spacing w:before="0" w:after="40" w:line="252" w:lineRule="auto"/>
+            </w:pPr>
+            <w:r>
+              <w:rPr>
+                <w:rFonts w:ascii="Calibri" w:hAnsi="Calibri"/>
+                <w:b w:val="0"/>
+                <w:color w:val="102A35"/>
+                <w:sz w:val="16"/>
+              </w:rPr>
+              <w:t>Pipeline SQS-Lambda-Neon completata fino allo stato completed su fixture temporanea.</w:t>
+            </w:r>
+          </w:p>
+        </w:tc>
+      </w:tr>
+      <w:tr>
+        <w:tc>
+          <w:tcPr>
+            <w:tcW w:type="dxa" w:w="2700"/>
+          </w:tcPr>
+          <w:p>
+            <w:pPr>
+              <w:spacing w:before="0" w:after="40" w:line="252" w:lineRule="auto"/>
+            </w:pPr>
+            <w:r>
+              <w:rPr>
+                <w:rFonts w:ascii="Calibri" w:hAnsi="Calibri"/>
+                <w:b/>
+                <w:color w:val="102A35"/>
+                <w:sz w:val="16"/>
+              </w:rPr>
+              <w:t>Browser autenticato</w:t>
+            </w:r>
+          </w:p>
+        </w:tc>
+        <w:tc>
+          <w:tcPr>
+            <w:tcW w:type="dxa" w:w="1500"/>
+            <w:shd w:fill="E7F4EA"/>
+          </w:tcPr>
+          <w:p>
+            <w:pPr>
+              <w:spacing w:before="0" w:after="40" w:line="252" w:lineRule="auto"/>
+            </w:pPr>
+            <w:r>
+              <w:rPr>
+                <w:rFonts w:ascii="Calibri" w:hAnsi="Calibri"/>
+                <w:b/>
+                <w:color w:val="23623A"/>
+                <w:sz w:val="16"/>
+              </w:rPr>
+              <w:t>SUPERATO</w:t>
+            </w:r>
+          </w:p>
+        </w:tc>
+        <w:tc>
+          <w:tcPr>
+            <w:tcW w:type="dxa" w:w="5160"/>
+          </w:tcPr>
+          <w:p>
+            <w:pPr>
+              <w:spacing w:before="0" w:after="40" w:line="252" w:lineRule="auto"/>
+            </w:pPr>
+            <w:r>
+              <w:rPr>
+                <w:rFonts w:ascii="Calibri" w:hAnsi="Calibri"/>
+                <w:b w:val="0"/>
+                <w:color w:val="102A35"/>
+                <w:sz w:val="16"/>
+              </w:rPr>
+              <w:t>Pannello responsabile, programma, gruppi, documenti, chat, agenti, analytics e login-come verificati.</w:t>
+            </w:r>
+          </w:p>
+        </w:tc>
+      </w:tr>
+      <w:tr>
+        <w:tc>
+          <w:tcPr>
+            <w:tcW w:type="dxa" w:w="2700"/>
+          </w:tcPr>
+          <w:p>
+            <w:pPr>
+              <w:spacing w:before="0" w:after="40" w:line="252" w:lineRule="auto"/>
+            </w:pPr>
+            <w:r>
+              <w:rPr>
+                <w:rFonts w:ascii="Calibri" w:hAnsi="Calibri"/>
+                <w:b/>
+                <w:color w:val="102A35"/>
+                <w:sz w:val="16"/>
+              </w:rPr>
+              <w:t>Layout mobile programma</w:t>
+            </w:r>
+          </w:p>
+        </w:tc>
+        <w:tc>
+          <w:tcPr>
+            <w:tcW w:type="dxa" w:w="1500"/>
+            <w:shd w:fill="E7F4EA"/>
+          </w:tcPr>
+          <w:p>
+            <w:pPr>
+              <w:spacing w:before="0" w:after="40" w:line="252" w:lineRule="auto"/>
+            </w:pPr>
+            <w:r>
+              <w:rPr>
+                <w:rFonts w:ascii="Calibri" w:hAnsi="Calibri"/>
+                <w:b/>
+                <w:color w:val="23623A"/>
+                <w:sz w:val="16"/>
+              </w:rPr>
+              <w:t>SUPERATO</w:t>
+            </w:r>
+          </w:p>
+        </w:tc>
+        <w:tc>
+          <w:tcPr>
+            <w:tcW w:type="dxa" w:w="5160"/>
+          </w:tcPr>
+          <w:p>
+            <w:pPr>
+              <w:spacing w:before="0" w:after="40" w:line="252" w:lineRule="auto"/>
+            </w:pPr>
+            <w:r>
+              <w:rPr>
+                <w:rFonts w:ascii="Calibri" w:hAnsi="Calibri"/>
+                <w:b w:val="0"/>
+                <w:color w:val="102A35"/>
+                <w:sz w:val="16"/>
+              </w:rPr>
+              <w:t>Corretto l'overflow della testata a 360 px rendendo Preventivi coerente con le altre schede.</w:t>
             </w:r>
           </w:p>
         </w:tc>
@@ -11519,6 +11699,15 @@
     </w:p>
     <w:p>
       <w:pPr>
+        <w:pStyle w:val="ListBullet"/>
+        <w:spacing w:after="60"/>
+      </w:pPr>
+      <w:r>
+        <w:t>La testata mobile del programma non supera più il viewport sui dispositivi Android compatti.</w:t>
+      </w:r>
+    </w:p>
+    <w:p>
+      <w:pPr>
         <w:pStyle w:val="Heading2"/>
       </w:pPr>
       <w:r>
@@ -11527,7 +11716,7 @@
     </w:p>
     <w:p>
       <w:r>
-        <w:t>La build e i controlli automatizzati disponibili sono verdi. Il punto 1 del piano resta aperto finché non vengono rieseguiti Bedrock, il ruolo database runtime e i percorsi browser autenticati. Questi elementi sono classificati come verifiche pendenti di ambiente, non come difetti applicativi confermati.</w:t>
+        <w:t>La build, i controlli automatici, Neon, AWS, Bedrock e il percorso browser autenticato risultano verdi. Il punto 1 del piano di consolidamento è chiuso. La lettura diretta della password della DSN runtime resta deliberatamente esclusa: ruolo, privilegi e collegamento applicativo sono stati verificati senza esporre il segreto.</w:t>
       </w:r>
     </w:p>
     <w:sectPr>

</xml_diff>